<commit_message>
Updated celery engine to send nudges to the participants phones
</commit_message>
<xml_diff>
--- a/Resources/JITAI_Task_Overview.docx
+++ b/Resources/JITAI_Task_Overview.docx
@@ -568,19 +568,19 @@
     <w:p>
       <w:pPr/>
       <w:r>
-        <w:t>Catalog source:  backend/app/data/REACTprompts.csv (Eliana Bacal). Loaded at module import by notification_service._load_catalog(). Eliana's revisions require only a CSV update and redeploy — no code change.</w:t>
+        <w:t>Catalog source (current, pending replacement):  backend/app/data/REACTprompts.csv (Eliana Bacal). Loaded at module import by notification_service._load_catalog(). Will be replaced by Eliana's reconciled active/parked catalog once delivered — no other code change expected beyond swapping the load source.</w:t>
       </w:r>
     </w:p>
     <w:p>
       <w:pPr/>
       <w:r>
-        <w:t>Selection rule (current):  All prompts with Trigger Condition = 'Survey' form the eligible pool. One is drawn at random. Domain routing (Alcohol vs. Eating vs. Cyber Aggression) is deferred until domain-specific EMA questions are finalized with Eliana.</w:t>
+        <w:t>Selection rule (as of 2026-08-19, pending wiring):  Dr. Chang ruled the IRB01 message bank (REACT_IRB01_Message_Bank_v1.docx — 26 CBT/ACT messages plus 4 active-control messages) governs what gets delivered, not REACTprompts.csv directly. Eliana Bacal owns reconciling the two files ID by ID, confirming overlapping prompts match the approved wording exactly, and marking each ID active vs. parked. CSV entries that don't survive reconciliation are marked inactive, not deleted, so the library history is preserved. The reconciled file becomes what this task loads. Until that file is delivered, the code still runs on the raw CSV as described below — do not treat this as already wired.</w:t>
       </w:r>
     </w:p>
     <w:p>
       <w:pPr/>
       <w:r>
-        <w:t>Telemetry prompts (Trigger Condition = 'Telemetry', P001–P012, P020–P032, P041–P045) are excluded from selection until the HRV/sleep spec from Celia is approved and wired in.</w:t>
+        <w:t>Telemetry prompts (Trigger Condition = 'Telemetry', P001–P012, P020–P032, P041–P045) remain excluded from selection — confirmed by Dr. Chang as intentional and unchanged: the cyber-aggression construct is still measured through the B5 check-in items and the telemetry logging itself, just not through message delivery, until the HRV/sleep spec from Celia is approved and wired in.</w:t>
       </w:r>
     </w:p>
     <w:p>
@@ -2106,7 +2106,7 @@
         <w:jc w:val="center"/>
       </w:pPr>
       <w:r>
-        <w:t>Last updated: 2026-07-16 · Author: Dustin Nguyen · SMASH Research Lab, UF</w:t>
+        <w:t>Last updated: 2026-08-24 · Author: Dustin Nguyen · SMASH Research Lab, UF</w:t>
       </w:r>
     </w:p>
     <w:sectPr>

</xml_diff>